<commit_message>
fix(refs): APA7 en-dash page ranges in dissertation reference list
APA 7th uses en-dashes (–) for page ranges; the reference list used hyphens.
Convert 194 page ranges (and pp. book-chapter ranges) to en-dash, leaving DOI
components (Wiley ISSN-based) and title date-ranges as hyphens. Rebuild the
references deliverable + LUAN_AN_FULL (embeds references) and refresh the
submission bundle. Also fix assemble_submission_folder.sh to preserve the
hand-maintained manifest (rm scoped to numbered subfolders).

Cross-reference audit (dissertation scope): every inline citation resolves to a
reference entry; DOIs all use https://doi.org/. No missing entries.
</commit_message>
<xml_diff>
--- a/dist/HO_SO_NOP/01_LUAN_AN/04_references_apa7.docx
+++ b/dist/HO_SO_NOP/01_LUAN_AN/04_references_apa7.docx
@@ -558,7 +558,7 @@
           <w:bCs/>
           <w:b/>
         </w:rPr>
-        <w:t xml:space="preserve">(6), 537-543.</w:t>
+        <w:t xml:space="preserve">(6), 537–543.</w:t>
       </w:r>
       <w:r>
         <w:t xml:space="preserve"> </w:t>
@@ -609,7 +609,7 @@
           <w:bCs/>
           <w:b/>
         </w:rPr>
-        <w:t xml:space="preserve">(1), 1-31.</w:t>
+        <w:t xml:space="preserve">(1), 1–31.</w:t>
       </w:r>
       <w:r>
         <w:t xml:space="preserve"> </w:t>
@@ -660,7 +660,7 @@
           <w:bCs/>
           <w:b/>
         </w:rPr>
-        <w:t xml:space="preserve">(5), 535-551.</w:t>
+        <w:t xml:space="preserve">(5), 535–551.</w:t>
       </w:r>
       <w:r>
         <w:t xml:space="preserve"> </w:t>
@@ -711,7 +711,7 @@
           <w:bCs/>
           <w:b/>
         </w:rPr>
-        <w:t xml:space="preserve">(3), 595-613.</w:t>
+        <w:t xml:space="preserve">(3), 595–613.</w:t>
       </w:r>
       <w:r>
         <w:t xml:space="preserve"> </w:t>
@@ -809,7 +809,7 @@
         <w:t xml:space="preserve">Eurasian Business Review, 14</w:t>
       </w:r>
       <w:r>
-        <w:t xml:space="preserve">(4), 881-915.</w:t>
+        <w:t xml:space="preserve">(4), 881–915.</w:t>
       </w:r>
     </w:p>
     <w:p>
@@ -851,7 +851,7 @@
         <w:t xml:space="preserve">Journal of International Business Studies, 50</w:t>
       </w:r>
       <w:r>
-        <w:t xml:space="preserve">(8), 1372-1387.</w:t>
+        <w:t xml:space="preserve">(8), 1372–1387.</w:t>
       </w:r>
     </w:p>
     <w:p>
@@ -893,7 +893,7 @@
         <w:t xml:space="preserve">IEEE Transactions on Engineering Management, 71</w:t>
       </w:r>
       <w:r>
-        <w:t xml:space="preserve">, 1-14.</w:t>
+        <w:t xml:space="preserve">, 1–14.</w:t>
       </w:r>
     </w:p>
     <w:p>
@@ -914,7 +914,7 @@
         <w:t xml:space="preserve">Managerial and Decision Economics, 43</w:t>
       </w:r>
       <w:r>
-        <w:t xml:space="preserve">(5), 1706-1720.</w:t>
+        <w:t xml:space="preserve">(5), 1706–1720.</w:t>
       </w:r>
     </w:p>
     <w:p>
@@ -935,7 +935,7 @@
         <w:t xml:space="preserve">Journal of World Business, 53</w:t>
       </w:r>
       <w:r>
-        <w:t xml:space="preserve">(2), 209-221.</w:t>
+        <w:t xml:space="preserve">(2), 209–221.</w:t>
       </w:r>
     </w:p>
     <w:p>
@@ -991,7 +991,7 @@
           <w:bCs/>
           <w:b/>
         </w:rPr>
-        <w:t xml:space="preserve">(1), 56-83.</w:t>
+        <w:t xml:space="preserve">(1), 56–83.</w:t>
       </w:r>
       <w:r>
         <w:t xml:space="preserve"> </w:t>
@@ -1028,7 +1028,7 @@
         <w:t xml:space="preserve">Journal of International Marketing, 29</w:t>
       </w:r>
       <w:r>
-        <w:t xml:space="preserve">(1), 57-76.</w:t>
+        <w:t xml:space="preserve">(1), 57–76.</w:t>
       </w:r>
     </w:p>
     <w:p>
@@ -1049,7 +1049,7 @@
         <w:t xml:space="preserve">Global Strategy Journal, 11</w:t>
       </w:r>
       <w:r>
-        <w:t xml:space="preserve">(1), 58-80.</w:t>
+        <w:t xml:space="preserve">(1), 58–80.</w:t>
       </w:r>
     </w:p>
     <w:p>
@@ -1070,7 +1070,7 @@
         <w:t xml:space="preserve">Journal of Business Research, 122</w:t>
       </w:r>
       <w:r>
-        <w:t xml:space="preserve">, 889-901.</w:t>
+        <w:t xml:space="preserve">, 889–901.</w:t>
       </w:r>
     </w:p>
     <w:p>
@@ -1105,7 +1105,7 @@
           <w:bCs/>
           <w:b/>
         </w:rPr>
-        <w:t xml:space="preserve">(4), 754-799.</w:t>
+        <w:t xml:space="preserve">(4), 754–799.</w:t>
       </w:r>
       <w:r>
         <w:t xml:space="preserve"> </w:t>
@@ -1174,7 +1174,7 @@
           <w:bCs/>
           <w:b/>
         </w:rPr>
-        <w:t xml:space="preserve">(13), 2305-2341.</w:t>
+        <w:t xml:space="preserve">(13), 2305–2341.</w:t>
       </w:r>
       <w:r>
         <w:t xml:space="preserve"> </w:t>
@@ -1225,7 +1225,7 @@
           <w:bCs/>
           <w:b/>
         </w:rPr>
-        <w:t xml:space="preserve">(2), 1-17.</w:t>
+        <w:t xml:space="preserve">(2), 1–17.</w:t>
       </w:r>
       <w:r>
         <w:t xml:space="preserve"> </w:t>
@@ -1272,7 +1272,7 @@
         <w:t xml:space="preserve">Journal of World Business, 47</w:t>
       </w:r>
       <w:r>
-        <w:t xml:space="preserve">(1), 73-80.</w:t>
+        <w:t xml:space="preserve">(1), 73–80.</w:t>
       </w:r>
     </w:p>
     <w:p>
@@ -1293,7 +1293,7 @@
         <w:t xml:space="preserve">Emerging Markets Finance and Trade, 55</w:t>
       </w:r>
       <w:r>
-        <w:t xml:space="preserve">(7), 1455-1471.</w:t>
+        <w:t xml:space="preserve">(7), 1455–1471.</w:t>
       </w:r>
     </w:p>
     <w:p>
@@ -1377,7 +1377,7 @@
         <w:t xml:space="preserve">Journal of International Management, 19</w:t>
       </w:r>
       <w:r>
-        <w:t xml:space="preserve">(2), 118-137.</w:t>
+        <w:t xml:space="preserve">(2), 118–137.</w:t>
       </w:r>
     </w:p>
     <w:p>
@@ -1429,7 +1429,7 @@
         <w:t xml:space="preserve">International Journal of Emerging Markets, 17</w:t>
       </w:r>
       <w:r>
-        <w:t xml:space="preserve">(4), 1085-1106.</w:t>
+        <w:t xml:space="preserve">(4), 1085–1106.</w:t>
       </w:r>
     </w:p>
     <w:p>
@@ -1450,7 +1450,7 @@
         <w:t xml:space="preserve">Journal of Financial and Quantitative Analysis, 46</w:t>
       </w:r>
       <w:r>
-        <w:t xml:space="preserve">(6), 1545-1580.</w:t>
+        <w:t xml:space="preserve">(6), 1545–1580.</w:t>
       </w:r>
     </w:p>
     <w:p>
@@ -1543,7 +1543,7 @@
         <w:t xml:space="preserve">Strategic Management Journal, 22</w:t>
       </w:r>
       <w:r>
-        <w:t xml:space="preserve">(6-7), 565-586.</w:t>
+        <w:t xml:space="preserve">(6-7), 565–586.</w:t>
       </w:r>
     </w:p>
     <w:p>
@@ -1564,7 +1564,7 @@
         <w:t xml:space="preserve">Journal of Business Research, 138</w:t>
       </w:r>
       <w:r>
-        <w:t xml:space="preserve">, 280-294.</w:t>
+        <w:t xml:space="preserve">, 280–294.</w:t>
       </w:r>
     </w:p>
     <w:p>
@@ -1585,7 +1585,7 @@
         <w:t xml:space="preserve">Journal of World Business, 43</w:t>
       </w:r>
       <w:r>
-        <w:t xml:space="preserve">(4), 475-485.</w:t>
+        <w:t xml:space="preserve">(4), 475–485.</w:t>
       </w:r>
     </w:p>
     <w:p>
@@ -1725,7 +1725,7 @@
           <w:bCs/>
           <w:b/>
         </w:rPr>
-        <w:t xml:space="preserve">(4), 678-693.</w:t>
+        <w:t xml:space="preserve">(4), 678–693.</w:t>
       </w:r>
       <w:r>
         <w:t xml:space="preserve"> </w:t>
@@ -1796,7 +1796,7 @@
         <w:t xml:space="preserve">Tạp chí Kinh tế và Phát triển, 311</w:t>
       </w:r>
       <w:r>
-        <w:t xml:space="preserve">, 24-38.</w:t>
+        <w:t xml:space="preserve">, 24–38.</w:t>
       </w:r>
     </w:p>
     <w:p>
@@ -3497,7 +3497,7 @@
         <w:t xml:space="preserve"> </w:t>
       </w:r>
       <w:r>
-        <w:t xml:space="preserve">(March 2026, Special Section, pp. 38-43). Asian Development Bank.</w:t>
+        <w:t xml:space="preserve">(March 2026, Special Section, pp. 38–43). Asian Development Bank.</w:t>
       </w:r>
     </w:p>
     <w:p>
@@ -3584,7 +3584,7 @@
           <w:bCs/>
           <w:b/>
         </w:rPr>
-        <w:t xml:space="preserve">(1), 47-65.</w:t>
+        <w:t xml:space="preserve">(1), 47–65.</w:t>
       </w:r>
       <w:r>
         <w:t xml:space="preserve"> </w:t>
@@ -3872,7 +3872,7 @@
         <w:t xml:space="preserve">Review of Economic Studies, 81</w:t>
       </w:r>
       <w:r>
-        <w:t xml:space="preserve">(2), 572-607. https://doi.org/10.1093/restud/rdt046</w:t>
+        <w:t xml:space="preserve">(2), 572–607. https://doi.org/10.1093/restud/rdt046</w:t>
       </w:r>
     </w:p>
     <w:p>
@@ -3893,7 +3893,7 @@
         <w:t xml:space="preserve">Journal of Management, 17</w:t>
       </w:r>
       <w:r>
-        <w:t xml:space="preserve">(1), 99-120. https://doi.org/10.1177/014920639101700108</w:t>
+        <w:t xml:space="preserve">(1), 99–120. https://doi.org/10.1177/014920639101700108</w:t>
       </w:r>
     </w:p>
     <w:p>
@@ -3914,7 +3914,7 @@
         <w:t xml:space="preserve">Management International Review, 47</w:t>
       </w:r>
       <w:r>
-        <w:t xml:space="preserve">(3), 319-347. https://doi.org/10.1007/s11575-007-0019-z</w:t>
+        <w:t xml:space="preserve">(3), 319–347. https://doi.org/10.1007/s11575-007-0019-z</w:t>
       </w:r>
     </w:p>
     <w:p>
@@ -3935,7 +3935,7 @@
         <w:t xml:space="preserve">Biometrics, 50</w:t>
       </w:r>
       <w:r>
-        <w:t xml:space="preserve">(4), 1088-1101. https://doi.org/10.2307/2533446</w:t>
+        <w:t xml:space="preserve">(4), 1088–1101. https://doi.org/10.2307/2533446</w:t>
       </w:r>
     </w:p>
     <w:p>
@@ -3956,7 +3956,7 @@
         <w:t xml:space="preserve">Asia Pacific Viewpoint, 47</w:t>
       </w:r>
       <w:r>
-        <w:t xml:space="preserve">(1), 1-13. https://doi.org/10.1111/j.1467-8373.2006.00297.x</w:t>
+        <w:t xml:space="preserve">(1), 1–13. https://doi.org/10.1111/j.1467-8373.2006.00297.x</w:t>
       </w:r>
     </w:p>
     <w:p>
@@ -3998,7 +3998,7 @@
         <w:t xml:space="preserve">American Economic Journal: Macroeconomics, 13</w:t>
       </w:r>
       <w:r>
-        <w:t xml:space="preserve">(1), 333-372. https://doi.org/10.1257/mac.20180386</w:t>
+        <w:t xml:space="preserve">(1), 333–372. https://doi.org/10.1257/mac.20180386</w:t>
       </w:r>
     </w:p>
     <w:p>
@@ -4019,7 +4019,7 @@
         <w:t xml:space="preserve">Journal of International Business Studies, 38</w:t>
       </w:r>
       <w:r>
-        <w:t xml:space="preserve">(4), 499-518. https://doi.org/10.1057/palgrave.jibs.8400277</w:t>
+        <w:t xml:space="preserve">(4), 499–518. https://doi.org/10.1057/palgrave.jibs.8400277</w:t>
       </w:r>
     </w:p>
     <w:p>
@@ -4040,7 +4040,7 @@
         <w:t xml:space="preserve">Administrative Science Quarterly, 35</w:t>
       </w:r>
       <w:r>
-        <w:t xml:space="preserve">(1), 128-152. https://doi.org/10.2307/2393553</w:t>
+        <w:t xml:space="preserve">(1), 128–152. https://doi.org/10.2307/2393553</w:t>
       </w:r>
     </w:p>
     <w:p>
@@ -4064,7 +4064,7 @@
         <w:t xml:space="preserve"> </w:t>
       </w:r>
       <w:r>
-        <w:t xml:space="preserve">(Vol. 2, pp. 259-286). Emerald.</w:t>
+        <w:t xml:space="preserve">(Vol. 2, pp. 259–286). Emerald.</w:t>
       </w:r>
     </w:p>
     <w:p>
@@ -4106,7 +4106,7 @@
         <w:t xml:space="preserve">Journal of International Economics, 111</w:t>
       </w:r>
       <w:r>
-        <w:t xml:space="preserve">, 177-189. https://doi.org/10.1016/j.jinteco.2018.01.008</w:t>
+        <w:t xml:space="preserve">, 177–189. https://doi.org/10.1016/j.jinteco.2018.01.008</w:t>
       </w:r>
     </w:p>
     <w:p>
@@ -4127,7 +4127,7 @@
         <w:t xml:space="preserve">Biometrics, 56</w:t>
       </w:r>
       <w:r>
-        <w:t xml:space="preserve">(2), 455-463. https://doi.org/10.1111/j.0006-341X.2000.00455.x</w:t>
+        <w:t xml:space="preserve">(2), 455–463. https://doi.org/10.1111/j.0006-341X.2000.00455.x</w:t>
       </w:r>
     </w:p>
     <w:p>
@@ -4148,7 +4148,7 @@
         <w:t xml:space="preserve">Journal of International Business Studies, 51</w:t>
       </w:r>
       <w:r>
-        <w:t xml:space="preserve">(9), 1609-1620. https://doi.org/10.1057/s41267-020-00374-2</w:t>
+        <w:t xml:space="preserve">(9), 1609–1620. https://doi.org/10.1057/s41267-020-00374-2</w:t>
       </w:r>
     </w:p>
     <w:p>
@@ -4169,7 +4169,7 @@
         <w:t xml:space="preserve">British Medical Journal, 315</w:t>
       </w:r>
       <w:r>
-        <w:t xml:space="preserve">(7109), 629-634. https://doi.org/10.1136/bmj.315.7109.629</w:t>
+        <w:t xml:space="preserve">(7109), 629–634. https://doi.org/10.1136/bmj.315.7109.629</w:t>
       </w:r>
     </w:p>
     <w:p>
@@ -4190,7 +4190,7 @@
         <w:t xml:space="preserve">Strategic Management Journal, 37</w:t>
       </w:r>
       <w:r>
-        <w:t xml:space="preserve">(7), 1177-1195. https://doi.org/10.1002/smj.2399</w:t>
+        <w:t xml:space="preserve">(7), 1177–1195. https://doi.org/10.1002/smj.2399</w:t>
       </w:r>
     </w:p>
     <w:p>
@@ -4232,7 +4232,7 @@
         <w:t xml:space="preserve">Management International Review, 47</w:t>
       </w:r>
       <w:r>
-        <w:t xml:space="preserve">(3), 423-452. https://doi.org/10.1007/s11575-007-0022-4</w:t>
+        <w:t xml:space="preserve">(3), 423–452. https://doi.org/10.1007/s11575-007-0022-4</w:t>
       </w:r>
     </w:p>
     <w:p>
@@ -4253,7 +4253,7 @@
         <w:t xml:space="preserve">Academy of Management Journal, 40</w:t>
       </w:r>
       <w:r>
-        <w:t xml:space="preserve">(4), 767-798. https://doi.org/10.2307/256948</w:t>
+        <w:t xml:space="preserve">(4), 767–798. https://doi.org/10.2307/256948</w:t>
       </w:r>
     </w:p>
     <w:p>
@@ -4274,7 +4274,7 @@
         <w:t xml:space="preserve">Quarterly Journal of Economics, 124</w:t>
       </w:r>
       <w:r>
-        <w:t xml:space="preserve">(4), 1403-1448. https://doi.org/10.1162/qjec.2009.124.4.1403</w:t>
+        <w:t xml:space="preserve">(4), 1403–1448. https://doi.org/10.1162/qjec.2009.124.4.1403</w:t>
       </w:r>
     </w:p>
     <w:p>
@@ -4295,7 +4295,7 @@
         <w:t xml:space="preserve">Multinational Business Review, 11</w:t>
       </w:r>
       <w:r>
-        <w:t xml:space="preserve">(3), 23-49. https://doi.org/10.1108/1525383X200300015</w:t>
+        <w:t xml:space="preserve">(3), 23–49. https://doi.org/10.1108/1525383X200300015</w:t>
       </w:r>
     </w:p>
     <w:p>
@@ -4316,7 +4316,7 @@
         <w:t xml:space="preserve">Journal of World Business, 48</w:t>
       </w:r>
       <w:r>
-        <w:t xml:space="preserve">(1), 1-12. https://doi.org/10.1016/j.jwb.2012.06.001</w:t>
+        <w:t xml:space="preserve">(1), 1–12. https://doi.org/10.1016/j.jwb.2012.06.001</w:t>
       </w:r>
     </w:p>
     <w:p>
@@ -4337,7 +4337,7 @@
         <w:t xml:space="preserve">Journal of International Business Studies, 8</w:t>
       </w:r>
       <w:r>
-        <w:t xml:space="preserve">(1), 23-32. https://doi.org/10.1057/palgrave.jibs.8490676</w:t>
+        <w:t xml:space="preserve">(1), 23–32. https://doi.org/10.1057/palgrave.jibs.8490676</w:t>
       </w:r>
     </w:p>
     <w:p>
@@ -4358,7 +4358,7 @@
         <w:t xml:space="preserve">Journal of International Business Studies, 51</w:t>
       </w:r>
       <w:r>
-        <w:t xml:space="preserve">(4), 577-622. https://doi.org/10.1057/s41267-020-00304-2</w:t>
+        <w:t xml:space="preserve">(4), 577–622. https://doi.org/10.1057/s41267-020-00304-2</w:t>
       </w:r>
     </w:p>
     <w:p>
@@ -4379,7 +4379,7 @@
         <w:t xml:space="preserve">Strategic Management Journal, 37</w:t>
       </w:r>
       <w:r>
-        <w:t xml:space="preserve">(6), 1154-1173. https://doi.org/10.1002/smj.2379</w:t>
+        <w:t xml:space="preserve">(6), 1154–1173. https://doi.org/10.1002/smj.2379</w:t>
       </w:r>
     </w:p>
     <w:p>
@@ -4421,7 +4421,7 @@
         <w:t xml:space="preserve">Journal of International Business Studies, 35</w:t>
       </w:r>
       <w:r>
-        <w:t xml:space="preserve">(2), 124-141. https://doi.org/10.1057/palgrave.jibs.8400071</w:t>
+        <w:t xml:space="preserve">(2), 124–141. https://doi.org/10.1057/palgrave.jibs.8400071</w:t>
       </w:r>
     </w:p>
     <w:p>
@@ -4442,7 +4442,7 @@
         <w:t xml:space="preserve">Journal of Economic Perspectives, 28</w:t>
       </w:r>
       <w:r>
-        <w:t xml:space="preserve">(3), 109-126. https://doi.org/10.1257/jep.28.3.109</w:t>
+        <w:t xml:space="preserve">(3), 109–126. https://doi.org/10.1257/jep.28.3.109</w:t>
       </w:r>
     </w:p>
     <w:p>
@@ -4463,7 +4463,7 @@
         <w:t xml:space="preserve">World Development, 20</w:t>
       </w:r>
       <w:r>
-        <w:t xml:space="preserve">(2), 165-186. https://doi.org/10.1016/0305-750X(92)90097-F</w:t>
+        <w:t xml:space="preserve">(2), 165–186. https://doi.org/10.1016/0305-750X(92)90097-F</w:t>
       </w:r>
     </w:p>
     <w:p>
@@ -4505,7 +4505,7 @@
         <w:t xml:space="preserve">Oxford Bulletin of Economics and Statistics, 72</w:t>
       </w:r>
       <w:r>
-        <w:t xml:space="preserve">(1), 109-118. https://doi.org/10.1111/j.1468-0084.2009.00569.x</w:t>
+        <w:t xml:space="preserve">(1), 109–118. https://doi.org/10.1111/j.1468-0084.2009.00569.x</w:t>
       </w:r>
     </w:p>
     <w:p>
@@ -4526,7 +4526,7 @@
         <w:t xml:space="preserve">The American Statistician, 54</w:t>
       </w:r>
       <w:r>
-        <w:t xml:space="preserve">(3), 217-224. https://doi.org/10.1080/00031305.2000.10474549</w:t>
+        <w:t xml:space="preserve">(3), 217–224. https://doi.org/10.1080/00031305.2000.10474549</w:t>
       </w:r>
     </w:p>
     <w:p>
@@ -4547,7 +4547,7 @@
         <w:t xml:space="preserve">Academy of Management Journal, 47</w:t>
       </w:r>
       <w:r>
-        <w:t xml:space="preserve">(4), 598-609. https://doi.org/10.2307/20159604</w:t>
+        <w:t xml:space="preserve">(4), 598–609. https://doi.org/10.2307/20159604</w:t>
       </w:r>
     </w:p>
     <w:p>
@@ -4568,7 +4568,7 @@
         <w:t xml:space="preserve">Journal of Econometrics, 29</w:t>
       </w:r>
       <w:r>
-        <w:t xml:space="preserve">(3), 305-325. https://doi.org/10.1016/0304-4076(85)90158-7</w:t>
+        <w:t xml:space="preserve">(3), 305–325. https://doi.org/10.1016/0304-4076(85)90158-7</w:t>
       </w:r>
     </w:p>
     <w:p>
@@ -4589,7 +4589,7 @@
         <w:t xml:space="preserve">Review of Economic Studies, 80</w:t>
       </w:r>
       <w:r>
-        <w:t xml:space="preserve">(2), 711-744. https://doi.org/10.1093/restud/rds036</w:t>
+        <w:t xml:space="preserve">(2), 711–744. https://doi.org/10.1093/restud/rds036</w:t>
       </w:r>
     </w:p>
     <w:p>
@@ -4610,7 +4610,7 @@
         <w:t xml:space="preserve">Journal of Management, 42</w:t>
       </w:r>
       <w:r>
-        <w:t xml:space="preserve">(5), 1075-1110. https://doi.org/10.1177/0149206315624963</w:t>
+        <w:t xml:space="preserve">(5), 1075–1110. https://doi.org/10.1177/0149206315624963</w:t>
       </w:r>
     </w:p>
     <w:p>
@@ -4631,7 +4631,7 @@
         <w:t xml:space="preserve">Journal of International Business Studies, 48</w:t>
       </w:r>
       <w:r>
-        <w:t xml:space="preserve">(5), 535-551. https://doi.org/10.1057/s41267-017-0078-8</w:t>
+        <w:t xml:space="preserve">(5), 535–551. https://doi.org/10.1057/s41267-017-0078-8</w:t>
       </w:r>
     </w:p>
     <w:p>
@@ -4673,7 +4673,7 @@
         <w:t xml:space="preserve">Criminology, 36</w:t>
       </w:r>
       <w:r>
-        <w:t xml:space="preserve">(4), 859-866. https://doi.org/10.1111/j.1745-9125.1998.tb01268.x</w:t>
+        <w:t xml:space="preserve">(4), 859–866. https://doi.org/10.1111/j.1745-9125.1998.tb01268.x</w:t>
       </w:r>
     </w:p>
     <w:p>
@@ -4694,7 +4694,7 @@
         <w:t xml:space="preserve">Journal of Management, 39</w:t>
       </w:r>
       <w:r>
-        <w:t xml:space="preserve">(2), 313-338. https://doi.org/10.1177/0149206311410060</w:t>
+        <w:t xml:space="preserve">(2), 313–338. https://doi.org/10.1177/0149206311410060</w:t>
       </w:r>
     </w:p>
     <w:p>
@@ -4715,7 +4715,7 @@
         <w:t xml:space="preserve">Academy of Management Journal, 58</w:t>
       </w:r>
       <w:r>
-        <w:t xml:space="preserve">(5), 1546-1571. https://doi.org/10.5465/amj.2013.0319</w:t>
+        <w:t xml:space="preserve">(5), 1546–1571. https://doi.org/10.5465/amj.2013.0319</w:t>
       </w:r>
     </w:p>
     <w:p>
@@ -4736,7 +4736,7 @@
         <w:t xml:space="preserve">International Business Review, 7</w:t>
       </w:r>
       <w:r>
-        <w:t xml:space="preserve">(3), 315-321. https://doi.org/10.1016/S0969-5931(98)00013-4</w:t>
+        <w:t xml:space="preserve">(3), 315–321. https://doi.org/10.1016/S0969-5931(98)00013-4</w:t>
       </w:r>
     </w:p>
     <w:p>
@@ -4757,7 +4757,7 @@
         <w:t xml:space="preserve">Journal of Management, 35</w:t>
       </w:r>
       <w:r>
-        <w:t xml:space="preserve">(3), 718-804. https://doi.org/10.1177/0149206308330560</w:t>
+        <w:t xml:space="preserve">(3), 718–804. https://doi.org/10.1177/0149206308330560</w:t>
       </w:r>
     </w:p>
     <w:p>
@@ -4778,7 +4778,7 @@
         <w:t xml:space="preserve">Research Synthesis Methods, 8</w:t>
       </w:r>
       <w:r>
-        <w:t xml:space="preserve">(4), 537-553. https://doi.org/10.1002/jrsm.1260</w:t>
+        <w:t xml:space="preserve">(4), 537–553. https://doi.org/10.1002/jrsm.1260</w:t>
       </w:r>
     </w:p>
     <w:p>
@@ -4799,7 +4799,7 @@
         <w:t xml:space="preserve">Academy of Management Journal, 39</w:t>
       </w:r>
       <w:r>
-        <w:t xml:space="preserve">(1), 179-196. https://doi.org/10.2307/256635</w:t>
+        <w:t xml:space="preserve">(1), 179–196. https://doi.org/10.2307/256635</w:t>
       </w:r>
     </w:p>
     <w:p>
@@ -4820,7 +4820,7 @@
         <w:t xml:space="preserve">Strategic Management Journal, 28</w:t>
       </w:r>
       <w:r>
-        <w:t xml:space="preserve">(13), 1319-1350. https://doi.org/10.1002/smj.640</w:t>
+        <w:t xml:space="preserve">(13), 1319–1350. https://doi.org/10.1002/smj.640</w:t>
       </w:r>
     </w:p>
     <w:p>
@@ -4841,7 +4841,7 @@
         <w:t xml:space="preserve">Strategic Management Journal, 18</w:t>
       </w:r>
       <w:r>
-        <w:t xml:space="preserve">(7), 509-533. https://doi.org/10.1002/smj.4250180702</w:t>
+        <w:t xml:space="preserve">(7), 509–533. https://doi.org/10.1002/smj.4250180702</w:t>
       </w:r>
     </w:p>
     <w:p>
@@ -4862,7 +4862,7 @@
         <w:t xml:space="preserve">Human Resource Development Review, 4</w:t>
       </w:r>
       <w:r>
-        <w:t xml:space="preserve">(3), 356-367. https://doi.org/10.1177/1534484305278283</w:t>
+        <w:t xml:space="preserve">(3), 356–367. https://doi.org/10.1177/1534484305278283</w:t>
       </w:r>
     </w:p>
     <w:p>
@@ -4904,7 +4904,7 @@
         <w:t xml:space="preserve">The World Economy, 30</w:t>
       </w:r>
       <w:r>
-        <w:t xml:space="preserve">(1), 60-82. https://doi.org/10.1111/j.1467-9701.2007.00872.x</w:t>
+        <w:t xml:space="preserve">(1), 60–82. https://doi.org/10.1111/j.1467-9701.2007.00872.x</w:t>
       </w:r>
     </w:p>
     <w:p>
@@ -4949,7 +4949,7 @@
         <w:t xml:space="preserve">Academy of Management Journal, 38</w:t>
       </w:r>
       <w:r>
-        <w:t xml:space="preserve">(2), 341-363. https://doi.org/10.2307/256411</w:t>
+        <w:t xml:space="preserve">(2), 341–363. https://doi.org/10.2307/256411</w:t>
       </w:r>
     </w:p>
     <w:p>
@@ -5245,7 +5245,7 @@
         <w:t xml:space="preserve">European Journal of Development Research, 33</w:t>
       </w:r>
       <w:r>
-        <w:t xml:space="preserve">(2), 304-329. https://doi.org/10.1057/s41287-021-00364-6</w:t>
+        <w:t xml:space="preserve">(2), 304–329. https://doi.org/10.1057/s41287-021-00364-6</w:t>
       </w:r>
     </w:p>
     <w:p>
@@ -5266,7 +5266,7 @@
         <w:t xml:space="preserve">Journal of Management Studies, 57</w:t>
       </w:r>
       <w:r>
-        <w:t xml:space="preserve">(1), 1-24. https://doi.org/10.1111/joms.12526</w:t>
+        <w:t xml:space="preserve">(1), 1–24. https://doi.org/10.1111/joms.12526</w:t>
       </w:r>
     </w:p>
     <w:p>
@@ -5287,7 +5287,7 @@
         <w:t xml:space="preserve">Advances in Methods and Practices in Psychological Science, 1</w:t>
       </w:r>
       <w:r>
-        <w:t xml:space="preserve">(2), 259-269. https://doi.org/10.1177/2515245918770963</w:t>
+        <w:t xml:space="preserve">(2), 259–269. https://doi.org/10.1177/2515245918770963</w:t>
       </w:r>
     </w:p>
     <w:p>
@@ -5329,7 +5329,7 @@
         <w:t xml:space="preserve">Strategic Management Journal, 21</w:t>
       </w:r>
       <w:r>
-        <w:t xml:space="preserve">(10-11), 1105-1121. https://doi.org/10.1002/smj.118</w:t>
+        <w:t xml:space="preserve">(10-11), 1105–1121. https://doi.org/10.1002/smj.118</w:t>
       </w:r>
     </w:p>
     <w:p>
@@ -5350,7 +5350,7 @@
         <w:t xml:space="preserve">Global Strategy Journal, 2</w:t>
       </w:r>
       <w:r>
-        <w:t xml:space="preserve">(2), 108-121. https://doi.org/10.1111/j.2042-5805.2012.01028.x</w:t>
+        <w:t xml:space="preserve">(2), 108–121. https://doi.org/10.1111/j.2042-5805.2012.01028.x</w:t>
       </w:r>
     </w:p>
     <w:p>
@@ -5371,7 +5371,7 @@
         <w:t xml:space="preserve">Econometrica, 71</w:t>
       </w:r>
       <w:r>
-        <w:t xml:space="preserve">(6), 1695-1725. https://doi.org/10.1111/1468-0262.00467</w:t>
+        <w:t xml:space="preserve">(6), 1695–1725. https://doi.org/10.1111/1468-0262.00467</w:t>
       </w:r>
     </w:p>
     <w:p>
@@ -5413,7 +5413,7 @@
         <w:t xml:space="preserve">Journal of Management, 46</w:t>
       </w:r>
       <w:r>
-        <w:t xml:space="preserve">(7), 1244-1256. https://doi.org/10.1177/0149206319846272</w:t>
+        <w:t xml:space="preserve">(7), 1244–1256. https://doi.org/10.1177/0149206319846272</w:t>
       </w:r>
     </w:p>
     <w:p>
@@ -7269,7 +7269,7 @@
         <w:t xml:space="preserve">Journal of International Business Studies, 49</w:t>
       </w:r>
       <w:r>
-        <w:t xml:space="preserve">(7), 832-857. https://doi.org/10.1057/s41267-017-0117-9</w:t>
+        <w:t xml:space="preserve">(7), 832–857. https://doi.org/10.1057/s41267-017-0117-9</w:t>
       </w:r>
     </w:p>
     <w:p>
@@ -7332,7 +7332,7 @@
         <w:t xml:space="preserve">Pakistan Journal of Commerce and Social Sciences, 10</w:t>
       </w:r>
       <w:r>
-        <w:t xml:space="preserve">(1), 76-90.</w:t>
+        <w:t xml:space="preserve">(1), 76–90.</w:t>
       </w:r>
     </w:p>
     <w:p>
@@ -7353,7 +7353,7 @@
         <w:t xml:space="preserve">International Journal of Hospitality Management, 31</w:t>
       </w:r>
       <w:r>
-        <w:t xml:space="preserve">(1), 39-48. https://doi.org/10.1016/j.ijhm.2011.05.003</w:t>
+        <w:t xml:space="preserve">(1), 39–48. https://doi.org/10.1016/j.ijhm.2011.05.003</w:t>
       </w:r>
     </w:p>
     <w:p>
@@ -7374,7 +7374,7 @@
         <w:t xml:space="preserve">Annals of Tourism Research, 57</w:t>
       </w:r>
       <w:r>
-        <w:t xml:space="preserve">, 100-112. https://doi.org/10.1016/j.annals.2015.12.008</w:t>
+        <w:t xml:space="preserve">, 100–112. https://doi.org/10.1016/j.annals.2015.12.008</w:t>
       </w:r>
     </w:p>
     <w:p>
@@ -7395,7 +7395,7 @@
         <w:t xml:space="preserve">Multinational Business Review, 16</w:t>
       </w:r>
       <w:r>
-        <w:t xml:space="preserve">(1), 53-77. https://doi.org/10.1108/1525383X200800003</w:t>
+        <w:t xml:space="preserve">(1), 53–77. https://doi.org/10.1108/1525383X200800003</w:t>
       </w:r>
     </w:p>
     <w:p>
@@ -7416,7 +7416,7 @@
         <w:t xml:space="preserve">International Business Review, 24</w:t>
       </w:r>
       <w:r>
-        <w:t xml:space="preserve">(5), 893-907. https://doi.org/10.1016/j.ibusrev.2015.03.003</w:t>
+        <w:t xml:space="preserve">(5), 893–907. https://doi.org/10.1016/j.ibusrev.2015.03.003</w:t>
       </w:r>
     </w:p>
     <w:p>
@@ -7437,7 +7437,7 @@
         <w:t xml:space="preserve">Strategic Management Journal, 37</w:t>
       </w:r>
       <w:r>
-        <w:t xml:space="preserve">(11), 2275-2290. https://doi.org/10.1002/smj.2429</w:t>
+        <w:t xml:space="preserve">(11), 2275–2290. https://doi.org/10.1002/smj.2429</w:t>
       </w:r>
     </w:p>
     <w:p>
@@ -7458,7 +7458,7 @@
         <w:t xml:space="preserve">Journal of Small Business Management, 56</w:t>
       </w:r>
       <w:r>
-        <w:t xml:space="preserve">(S1), 170-185. https://doi.org/10.1111/jsbm.12393</w:t>
+        <w:t xml:space="preserve">(S1), 170–185. https://doi.org/10.1111/jsbm.12393</w:t>
       </w:r>
     </w:p>
     <w:p>
@@ -7479,7 +7479,7 @@
         <w:t xml:space="preserve">Journal of Business Research, 72</w:t>
       </w:r>
       <w:r>
-        <w:t xml:space="preserve">, 104-113. https://doi.org/10.1016/j.jbusres.2016.11.021</w:t>
+        <w:t xml:space="preserve">, 104–113. https://doi.org/10.1016/j.jbusres.2016.11.021</w:t>
       </w:r>
     </w:p>
     <w:p>
@@ -7500,7 +7500,7 @@
         <w:t xml:space="preserve">International Journal of Contemporary Hospitality Management, 28</w:t>
       </w:r>
       <w:r>
-        <w:t xml:space="preserve">(1), 179-202. https://doi.org/10.1108/IJCHM-10-2014-0517</w:t>
+        <w:t xml:space="preserve">(1), 179–202. https://doi.org/10.1108/IJCHM-10-2014-0517</w:t>
       </w:r>
     </w:p>
     <w:p>
@@ -7521,7 +7521,7 @@
         <w:t xml:space="preserve">International Business Review, 17</w:t>
       </w:r>
       <w:r>
-        <w:t xml:space="preserve">(5), 600-615. https://doi.org/10.1016/j.ibusrev.2008.08.001</w:t>
+        <w:t xml:space="preserve">(5), 600–615. https://doi.org/10.1016/j.ibusrev.2008.08.001</w:t>
       </w:r>
     </w:p>
     <w:p>
@@ -7542,7 +7542,7 @@
         <w:t xml:space="preserve">Journal of International Business Studies, 34</w:t>
       </w:r>
       <w:r>
-        <w:t xml:space="preserve">(4), 345-355. https://doi.org/10.1057/palgrave.jibs.8400036</w:t>
+        <w:t xml:space="preserve">(4), 345–355. https://doi.org/10.1057/palgrave.jibs.8400036</w:t>
       </w:r>
     </w:p>
     <w:p>
@@ -7563,7 +7563,7 @@
         <w:t xml:space="preserve">Journal of Management, 30</w:t>
       </w:r>
       <w:r>
-        <w:t xml:space="preserve">(4), 509-528. https://doi.org/10.1016/j.jm.2004.02.001</w:t>
+        <w:t xml:space="preserve">(4), 509–528. https://doi.org/10.1016/j.jm.2004.02.001</w:t>
       </w:r>
     </w:p>
     <w:p>
@@ -7584,7 +7584,7 @@
         <w:t xml:space="preserve">Journal of World Business, 45</w:t>
       </w:r>
       <w:r>
-        <w:t xml:space="preserve">(1), 93-103. https://doi.org/10.1016/j.jwb.2009.04.005</w:t>
+        <w:t xml:space="preserve">(1), 93–103. https://doi.org/10.1016/j.jwb.2009.04.005</w:t>
       </w:r>
     </w:p>
     <w:p>
@@ -7605,7 +7605,7 @@
         <w:t xml:space="preserve">Journal of World Business, 42</w:t>
       </w:r>
       <w:r>
-        <w:t xml:space="preserve">(2), 184-197. https://doi.org/10.1016/j.jwb.2007.02.007</w:t>
+        <w:t xml:space="preserve">(2), 184–197. https://doi.org/10.1016/j.jwb.2007.02.007</w:t>
       </w:r>
     </w:p>
     <w:p>
@@ -7626,7 +7626,7 @@
         <w:t xml:space="preserve">International Journal of Entrepreneurship and Small Business, 14</w:t>
       </w:r>
       <w:r>
-        <w:t xml:space="preserve">(4), 496-518. https://doi.org/10.1504/IJESB.2011.043273</w:t>
+        <w:t xml:space="preserve">(4), 496–518. https://doi.org/10.1504/IJESB.2011.043273</w:t>
       </w:r>
     </w:p>
     <w:p>
@@ -7647,7 +7647,7 @@
         <w:t xml:space="preserve">Small Business Economics, 26</w:t>
       </w:r>
       <w:r>
-        <w:t xml:space="preserve">(5), 475-492. https://doi.org/10.1007/s11187-005-5604-6</w:t>
+        <w:t xml:space="preserve">(5), 475–492. https://doi.org/10.1007/s11187-005-5604-6</w:t>
       </w:r>
     </w:p>
     <w:p>
@@ -7668,7 +7668,7 @@
         <w:t xml:space="preserve">Management Research Review, 41</w:t>
       </w:r>
       <w:r>
-        <w:t xml:space="preserve">(9), 1053-1071. https://doi.org/10.1108/MRR-06-2017-0175</w:t>
+        <w:t xml:space="preserve">(9), 1053–1071. https://doi.org/10.1108/MRR-06-2017-0175</w:t>
       </w:r>
     </w:p>
     <w:p>
@@ -7689,7 +7689,7 @@
         <w:t xml:space="preserve">Organizacija, 43</w:t>
       </w:r>
       <w:r>
-        <w:t xml:space="preserve">(5), 175-185. https://doi.org/10.2478/v10051-010-0017-y</w:t>
+        <w:t xml:space="preserve">(5), 175–185. https://doi.org/10.2478/v10051-010-0017-y</w:t>
       </w:r>
     </w:p>
     <w:p>
@@ -7710,7 +7710,7 @@
         <w:t xml:space="preserve">Multinational Business Review, 14</w:t>
       </w:r>
       <w:r>
-        <w:t xml:space="preserve">(3), 21-45. https://doi.org/10.1108/1525383X200600015</w:t>
+        <w:t xml:space="preserve">(3), 21–45. https://doi.org/10.1108/1525383X200600015</w:t>
       </w:r>
     </w:p>
     <w:p>
@@ -7731,7 +7731,7 @@
         <w:t xml:space="preserve">Asian Business &amp; Management, 10</w:t>
       </w:r>
       <w:r>
-        <w:t xml:space="preserve">(4), 515-535. https://doi.org/10.1057/abm.2011.27</w:t>
+        <w:t xml:space="preserve">(4), 515–535. https://doi.org/10.1057/abm.2011.27</w:t>
       </w:r>
     </w:p>
     <w:p>
@@ -7752,7 +7752,7 @@
         <w:t xml:space="preserve">Journal of Business Venturing, 28</w:t>
       </w:r>
       <w:r>
-        <w:t xml:space="preserve">(2), 316-334. https://doi.org/10.1016/j.jbusvent.2012.05.002</w:t>
+        <w:t xml:space="preserve">(2), 316–334. https://doi.org/10.1016/j.jbusvent.2012.05.002</w:t>
       </w:r>
     </w:p>
     <w:p>
@@ -7773,7 +7773,7 @@
         <w:t xml:space="preserve">Academy of Management Proceedings, 2007</w:t>
       </w:r>
       <w:r>
-        <w:t xml:space="preserve">(1), 1-6. https://doi.org/10.5465/ambpp.2007.26508474</w:t>
+        <w:t xml:space="preserve">(1), 1–6. https://doi.org/10.5465/ambpp.2007.26508474</w:t>
       </w:r>
     </w:p>
     <w:p>
@@ -7794,7 +7794,7 @@
         <w:t xml:space="preserve">South Asian Journal of Business Studies, 6</w:t>
       </w:r>
       <w:r>
-        <w:t xml:space="preserve">(3), 259-282. https://doi.org/10.1108/SAJBS-03-2016-0020</w:t>
+        <w:t xml:space="preserve">(3), 259–282. https://doi.org/10.1108/SAJBS-03-2016-0020</w:t>
       </w:r>
     </w:p>
     <w:p>
@@ -7815,7 +7815,7 @@
         <w:t xml:space="preserve">Journal of International Management, 15</w:t>
       </w:r>
       <w:r>
-        <w:t xml:space="preserve">(4), 413-431. https://doi.org/10.1016/j.intman.2009.01.003</w:t>
+        <w:t xml:space="preserve">(4), 413–431. https://doi.org/10.1016/j.intman.2009.01.003</w:t>
       </w:r>
     </w:p>
     <w:p>
@@ -7836,7 +7836,7 @@
         <w:t xml:space="preserve">Management International Review, 47</w:t>
       </w:r>
       <w:r>
-        <w:t xml:space="preserve">(3), 307-317. https://doi.org/10.1007/s11575-007-0018-0</w:t>
+        <w:t xml:space="preserve">(3), 307–317. https://doi.org/10.1007/s11575-007-0018-0</w:t>
       </w:r>
     </w:p>
     <w:p>
@@ -7857,7 +7857,7 @@
         <w:t xml:space="preserve">British Journal of Management, 20</w:t>
       </w:r>
       <w:r>
-        <w:t xml:space="preserve">(2), 172-186. https://doi.org/10.1111/j.1467-8551.2008.00558.x</w:t>
+        <w:t xml:space="preserve">(2), 172–186. https://doi.org/10.1111/j.1467-8551.2008.00558.x</w:t>
       </w:r>
     </w:p>
     <w:p>
@@ -7878,7 +7878,7 @@
         <w:t xml:space="preserve">Family Business Review, 27</w:t>
       </w:r>
       <w:r>
-        <w:t xml:space="preserve">(2), 142-160. https://doi.org/10.1177/0894486513510534</w:t>
+        <w:t xml:space="preserve">(2), 142–160. https://doi.org/10.1177/0894486513510534</w:t>
       </w:r>
     </w:p>
     <w:p>
@@ -7899,7 +7899,7 @@
         <w:t xml:space="preserve">International Small Business Journal, 32</w:t>
       </w:r>
       <w:r>
-        <w:t xml:space="preserve">(4), 386-400. https://doi.org/10.1177/0266242613485778</w:t>
+        <w:t xml:space="preserve">(4), 386–400. https://doi.org/10.1177/0266242613485778</w:t>
       </w:r>
     </w:p>
     <w:p>
@@ -7920,7 +7920,7 @@
         <w:t xml:space="preserve">Economics Research-Ekonomska Istraživanja, 31</w:t>
       </w:r>
       <w:r>
-        <w:t xml:space="preserve">(1), 1770-1789. https://doi.org/10.1080/1331677X.2018.1504673</w:t>
+        <w:t xml:space="preserve">(1), 1770–1789. https://doi.org/10.1080/1331677X.2018.1504673</w:t>
       </w:r>
     </w:p>
     <w:p>
@@ -7941,7 +7941,7 @@
         <w:t xml:space="preserve">International Journal of Business and Society, 20</w:t>
       </w:r>
       <w:r>
-        <w:t xml:space="preserve">(3), 1134-1152.</w:t>
+        <w:t xml:space="preserve">(3), 1134–1152.</w:t>
       </w:r>
     </w:p>
     <w:p>
@@ -7962,7 +7962,7 @@
         <w:t xml:space="preserve">Journal of International Business and Economy, 22</w:t>
       </w:r>
       <w:r>
-        <w:t xml:space="preserve">(2), 1-22.</w:t>
+        <w:t xml:space="preserve">(2), 1–22.</w:t>
       </w:r>
     </w:p>
     <w:p>
@@ -7983,7 +7983,7 @@
         <w:t xml:space="preserve">Vikalpa: The Journal for Decision Makers, 33</w:t>
       </w:r>
       <w:r>
-        <w:t xml:space="preserve">(4), 13-24.</w:t>
+        <w:t xml:space="preserve">(4), 13–24.</w:t>
       </w:r>
     </w:p>
     <w:p>
@@ -8004,7 +8004,7 @@
         <w:t xml:space="preserve">International Business: Research, Teaching, and Practice, 1</w:t>
       </w:r>
       <w:r>
-        <w:t xml:space="preserve">(1), 1-20.</w:t>
+        <w:t xml:space="preserve">(1), 1–20.</w:t>
       </w:r>
     </w:p>
     <w:p>
@@ -8025,7 +8025,7 @@
         <w:t xml:space="preserve">Asian Review of Accounting, 21</w:t>
       </w:r>
       <w:r>
-        <w:t xml:space="preserve">(2), 115-133. https://doi.org/10.1108/ARA-09-2012-0061</w:t>
+        <w:t xml:space="preserve">(2), 115–133. https://doi.org/10.1108/ARA-09-2012-0061</w:t>
       </w:r>
     </w:p>
     <w:p>
@@ -8046,7 +8046,7 @@
         <w:t xml:space="preserve">Journal of Business Research, 131</w:t>
       </w:r>
       <w:r>
-        <w:t xml:space="preserve">, 81-91. https://doi.org/10.1016/j.jbusres.2021.03.060</w:t>
+        <w:t xml:space="preserve">, 81–91. https://doi.org/10.1016/j.jbusres.2021.03.060</w:t>
       </w:r>
     </w:p>
     <w:p>
@@ -8067,7 +8067,7 @@
         <w:t xml:space="preserve">International Journal of Trade, Economics and Finance, 10</w:t>
       </w:r>
       <w:r>
-        <w:t xml:space="preserve">(3), 84-89. https://doi.org/10.18178/ijtef.2019.10.3.645</w:t>
+        <w:t xml:space="preserve">(3), 84–89. https://doi.org/10.18178/ijtef.2019.10.3.645</w:t>
       </w:r>
     </w:p>
     <w:p>
@@ -8088,7 +8088,7 @@
         <w:t xml:space="preserve">International Small Business Journal, 21</w:t>
       </w:r>
       <w:r>
-        <w:t xml:space="preserve">(3), 249-268. https://doi.org/10.1177/0266242603021003001</w:t>
+        <w:t xml:space="preserve">(3), 249–268. https://doi.org/10.1177/0266242603021003001</w:t>
       </w:r>
     </w:p>
     <w:p>
@@ -8109,7 +8109,7 @@
         <w:t xml:space="preserve">Journal of Business Venturing, 11</w:t>
       </w:r>
       <w:r>
-        <w:t xml:space="preserve">(1), 23-40. https://doi.org/10.1016/0883-9026(95)00081-X</w:t>
+        <w:t xml:space="preserve">(1), 23–40. https://doi.org/10.1016/0883-9026(95)00081-X</w:t>
       </w:r>
     </w:p>
     <w:p>
@@ -8130,7 +8130,7 @@
         <w:t xml:space="preserve">International Business Review, 25</w:t>
       </w:r>
       <w:r>
-        <w:t xml:space="preserve">(4), 907-920. https://doi.org/10.1016/j.ibusrev.2015.12.001</w:t>
+        <w:t xml:space="preserve">(4), 907–920. https://doi.org/10.1016/j.ibusrev.2015.12.001</w:t>
       </w:r>
     </w:p>
     <w:p>
@@ -8151,7 +8151,7 @@
         <w:t xml:space="preserve">Management International Review, 57</w:t>
       </w:r>
       <w:r>
-        <w:t xml:space="preserve">(2), 153-177. https://doi.org/10.1007/s11575-016-0284-7</w:t>
+        <w:t xml:space="preserve">(2), 153–177. https://doi.org/10.1007/s11575-016-0284-7</w:t>
       </w:r>
     </w:p>
     <w:p>
@@ -8193,7 +8193,7 @@
         <w:t xml:space="preserve">Sinergie Italian Journal of Management, 35</w:t>
       </w:r>
       <w:r>
-        <w:t xml:space="preserve">(102), 49-70. https://doi.org/10.7433/s102.2017.04</w:t>
+        <w:t xml:space="preserve">(102), 49–70. https://doi.org/10.7433/s102.2017.04</w:t>
       </w:r>
     </w:p>
     <w:p>
@@ -8214,7 +8214,7 @@
         <w:t xml:space="preserve">Multinational Business Review, 17</w:t>
       </w:r>
       <w:r>
-        <w:t xml:space="preserve">(2), 69-90. https://doi.org/10.1108/1525383X200900012</w:t>
+        <w:t xml:space="preserve">(2), 69–90. https://doi.org/10.1108/1525383X200900012</w:t>
       </w:r>
     </w:p>
     <w:p>
@@ -8235,7 +8235,7 @@
         <w:t xml:space="preserve">Engineering, Construction and Architectural Management, 19</w:t>
       </w:r>
       <w:r>
-        <w:t xml:space="preserve">(2), 202-220. https://doi.org/10.1108/09699981211205849</w:t>
+        <w:t xml:space="preserve">(2), 202–220. https://doi.org/10.1108/09699981211205849</w:t>
       </w:r>
     </w:p>
     <w:p>
@@ -8256,7 +8256,7 @@
         <w:t xml:space="preserve">International Journal of Business and Globalisation, 21</w:t>
       </w:r>
       <w:r>
-        <w:t xml:space="preserve">(3), 388-404. https://doi.org/10.1504/IJBG.2018.095267</w:t>
+        <w:t xml:space="preserve">(3), 388–404. https://doi.org/10.1504/IJBG.2018.095267</w:t>
       </w:r>
     </w:p>
     <w:p>
@@ -8298,7 +8298,7 @@
         <w:t xml:space="preserve">Journal of World Business, 53</w:t>
       </w:r>
       <w:r>
-        <w:t xml:space="preserve">(5), 645-657. https://doi.org/10.1016/j.jwb.2018.03.006</w:t>
+        <w:t xml:space="preserve">(5), 645–657. https://doi.org/10.1016/j.jwb.2018.03.006</w:t>
       </w:r>
     </w:p>
     <w:p>
@@ -8340,7 +8340,7 @@
         <w:t xml:space="preserve">Journal of Business Venturing, 17</w:t>
       </w:r>
       <w:r>
-        <w:t xml:space="preserve">(6), 611-633. https://doi.org/10.1016/S0883-9026(01)00079-5</w:t>
+        <w:t xml:space="preserve">(6), 611–633. https://doi.org/10.1016/S0883-9026(01)00079-5</w:t>
       </w:r>
     </w:p>
     <w:p>
@@ -8361,7 +8361,7 @@
         <w:t xml:space="preserve">Management International Review, 47</w:t>
       </w:r>
       <w:r>
-        <w:t xml:space="preserve">(3), 349-368. https://doi.org/10.1007/s11575-007-0015-4</w:t>
+        <w:t xml:space="preserve">(3), 349–368. https://doi.org/10.1007/s11575-007-0015-4</w:t>
       </w:r>
     </w:p>
     <w:p>
@@ -8382,7 +8382,7 @@
         <w:t xml:space="preserve">Management International Review, 43</w:t>
       </w:r>
       <w:r>
-        <w:t xml:space="preserve">(1), 63-83.</w:t>
+        <w:t xml:space="preserve">(1), 63–83.</w:t>
       </w:r>
     </w:p>
     <w:p>
@@ -8403,7 +8403,7 @@
         <w:t xml:space="preserve">Oxford Bulletin of Economics and Statistics, 44</w:t>
       </w:r>
       <w:r>
-        <w:t xml:space="preserve">(1), 1-13. https://doi.org/10.1111/j.1468-0084.1982.mp44001001.x</w:t>
+        <w:t xml:space="preserve">(1), 1–13. https://doi.org/10.1111/j.1468-0084.1982.mp44001001.x</w:t>
       </w:r>
     </w:p>
     <w:p>
@@ -8424,7 +8424,7 @@
         <w:t xml:space="preserve">Journal of International Business Studies, 50</w:t>
       </w:r>
       <w:r>
-        <w:t xml:space="preserve">(2), 253-261. https://doi.org/10.1057/s41267-018-0197-4</w:t>
+        <w:t xml:space="preserve">(2), 253–261. https://doi.org/10.1057/s41267-018-0197-4</w:t>
       </w:r>
     </w:p>
     <w:p>
@@ -8445,7 +8445,7 @@
         <w:t xml:space="preserve">Journal of Business Research, 59</w:t>
       </w:r>
       <w:r>
-        <w:t xml:space="preserve">(4), 501-507. https://doi.org/10.1016/j.jbusres.2005.09.008</w:t>
+        <w:t xml:space="preserve">(4), 501–507. https://doi.org/10.1016/j.jbusres.2005.09.008</w:t>
       </w:r>
     </w:p>
     <w:p>
@@ -8466,7 +8466,7 @@
         <w:t xml:space="preserve">Multinational Business Review, 12</w:t>
       </w:r>
       <w:r>
-        <w:t xml:space="preserve">(1), 89-110. https://doi.org/10.1108/1525383X200400005</w:t>
+        <w:t xml:space="preserve">(1), 89–110. https://doi.org/10.1108/1525383X200400005</w:t>
       </w:r>
     </w:p>
     <w:p>
@@ -8487,7 +8487,7 @@
         <w:t xml:space="preserve">Asia Pacific Journal of Management, 29</w:t>
       </w:r>
       <w:r>
-        <w:t xml:space="preserve">(3), 617-642. https://doi.org/10.1007/s10490-010-9240-5</w:t>
+        <w:t xml:space="preserve">(3), 617–642. https://doi.org/10.1007/s10490-010-9240-5</w:t>
       </w:r>
     </w:p>
     <w:p>
@@ -8508,7 +8508,7 @@
         <w:t xml:space="preserve">Management International Review, 53</w:t>
       </w:r>
       <w:r>
-        <w:t xml:space="preserve">(2), 175-193. https://doi.org/10.1007/s11575-012-0135-1</w:t>
+        <w:t xml:space="preserve">(2), 175–193. https://doi.org/10.1007/s11575-012-0135-1</w:t>
       </w:r>
     </w:p>
     <w:p>
@@ -8529,7 +8529,7 @@
         <w:t xml:space="preserve">Journal of Indian Business Research, 8</w:t>
       </w:r>
       <w:r>
-        <w:t xml:space="preserve">(2), 130-149. https://doi.org/10.1108/JIBR-10-2015-0087</w:t>
+        <w:t xml:space="preserve">(2), 130–149. https://doi.org/10.1108/JIBR-10-2015-0087</w:t>
       </w:r>
     </w:p>
     <w:p>
@@ -8550,7 +8550,7 @@
         <w:t xml:space="preserve">International Journal of Emerging Markets, 13</w:t>
       </w:r>
       <w:r>
-        <w:t xml:space="preserve">(1), 95-118. https://doi.org/10.1108/IJoEM-11-2016-0298</w:t>
+        <w:t xml:space="preserve">(1), 95–118. https://doi.org/10.1108/IJoEM-11-2016-0298</w:t>
       </w:r>
     </w:p>
     <w:p>
@@ -8571,7 +8571,7 @@
         <w:t xml:space="preserve">Cuadernos de Economía y Dirección de la Empresa, 10</w:t>
       </w:r>
       <w:r>
-        <w:t xml:space="preserve">(33), 31-62.</w:t>
+        <w:t xml:space="preserve">(33), 31–62.</w:t>
       </w:r>
     </w:p>
     <w:p>
@@ -8592,7 +8592,7 @@
         <w:t xml:space="preserve">Journal of World Business, 49</w:t>
       </w:r>
       <w:r>
-        <w:t xml:space="preserve">(1), 132-142. https://doi.org/10.1016/j.jwb.2013.04.003</w:t>
+        <w:t xml:space="preserve">(1), 132–142. https://doi.org/10.1016/j.jwb.2013.04.003</w:t>
       </w:r>
     </w:p>
     <w:bookmarkEnd w:id="44"/>
@@ -8665,7 +8665,7 @@
         <w:t xml:space="preserve">Entrepreneurial Business and Economics Review, 9</w:t>
       </w:r>
       <w:r>
-        <w:t xml:space="preserve">(2), 85-104. https://doi.org/10.15678/eber.2021.090206</w:t>
+        <w:t xml:space="preserve">(2), 85–104. https://doi.org/10.15678/eber.2021.090206</w:t>
       </w:r>
     </w:p>
     <w:p>
@@ -8686,7 +8686,7 @@
         <w:t xml:space="preserve">Oeconomia Copernicana, 12</w:t>
       </w:r>
       <w:r>
-        <w:t xml:space="preserve">(1), 53-75. https://doi.org/10.24136/oc.2021.003</w:t>
+        <w:t xml:space="preserve">(1), 53–75. https://doi.org/10.24136/oc.2021.003</w:t>
       </w:r>
     </w:p>
     <w:p>
@@ -8707,7 +8707,7 @@
         <w:t xml:space="preserve">Journal of Policy Modeling, 40</w:t>
       </w:r>
       <w:r>
-        <w:t xml:space="preserve">(5), 1022-1039. https://doi.org/10.1016/j.jpolmod.2018.01.008</w:t>
+        <w:t xml:space="preserve">(5), 1022–1039. https://doi.org/10.1016/j.jpolmod.2018.01.008</w:t>
       </w:r>
     </w:p>
     <w:p>
@@ -8749,7 +8749,7 @@
         <w:t xml:space="preserve">Strategic Entrepreneurship Journal, 4</w:t>
       </w:r>
       <w:r>
-        <w:t xml:space="preserve">(2), 183-192. https://doi.org/10.1002/sej.90</w:t>
+        <w:t xml:space="preserve">(2), 183–192. https://doi.org/10.1002/sej.90</w:t>
       </w:r>
     </w:p>
     <w:p>
@@ -8770,7 +8770,7 @@
         <w:t xml:space="preserve">Industrial Marketing Management, 39</w:t>
       </w:r>
       <w:r>
-        <w:t xml:space="preserve">(7), 1103-1110. https://doi.org/10.1016/j.indmarman.2009.10.001</w:t>
+        <w:t xml:space="preserve">(7), 1103–1110. https://doi.org/10.1016/j.indmarman.2009.10.001</w:t>
       </w:r>
     </w:p>
     <w:p>
@@ -8791,7 +8791,7 @@
         <w:t xml:space="preserve">Journal of International Business Studies, 48</w:t>
       </w:r>
       <w:r>
-        <w:t xml:space="preserve">(9), 1151-1164. https://doi.org/10.1057/s41267-017-0120-x</w:t>
+        <w:t xml:space="preserve">(9), 1151–1164. https://doi.org/10.1057/s41267-017-0120-x</w:t>
       </w:r>
     </w:p>
     <w:p>
@@ -8812,7 +8812,7 @@
         <w:t xml:space="preserve">Journal of World Business, 53</w:t>
       </w:r>
       <w:r>
-        <w:t xml:space="preserve">(2), 209-221. https://doi.org/10.1016/j.jwb.2017.11.002</w:t>
+        <w:t xml:space="preserve">(2), 209–221. https://doi.org/10.1016/j.jwb.2017.11.002</w:t>
       </w:r>
     </w:p>
     <w:p>
@@ -8854,7 +8854,7 @@
         <w:t xml:space="preserve">Cross Cultural &amp; Strategic Management, 27</w:t>
       </w:r>
       <w:r>
-        <w:t xml:space="preserve">(1), 1-25. https://doi.org/10.1108/ccsm-04-2019-0075</w:t>
+        <w:t xml:space="preserve">(1), 1–25. https://doi.org/10.1108/ccsm-04-2019-0075</w:t>
       </w:r>
     </w:p>
     <w:p>
@@ -8875,7 +8875,7 @@
         <w:t xml:space="preserve">Management and Organization Review, 17</w:t>
       </w:r>
       <w:r>
-        <w:t xml:space="preserve">(1), 173-197. https://doi.org/10.1017/mor.2020.39</w:t>
+        <w:t xml:space="preserve">(1), 173–197. https://doi.org/10.1017/mor.2020.39</w:t>
       </w:r>
     </w:p>
     <w:p>
@@ -8896,7 +8896,7 @@
         <w:t xml:space="preserve">Thunderbird International Business Review, 54</w:t>
       </w:r>
       <w:r>
-        <w:t xml:space="preserve">(5), 653-665. https://doi.org/10.1002/tie.21491</w:t>
+        <w:t xml:space="preserve">(5), 653–665. https://doi.org/10.1002/tie.21491</w:t>
       </w:r>
     </w:p>
     <w:p>
@@ -8917,7 +8917,7 @@
         <w:t xml:space="preserve">Spanish Journal of Finance and Accounting, 50</w:t>
       </w:r>
       <w:r>
-        <w:t xml:space="preserve">(4), 441-468. https://doi.org/10.1080/02102412.2021.1886453</w:t>
+        <w:t xml:space="preserve">(4), 441–468. https://doi.org/10.1080/02102412.2021.1886453</w:t>
       </w:r>
     </w:p>
     <w:p>
@@ -9043,7 +9043,7 @@
         <w:t xml:space="preserve">Journal of International Management, 17</w:t>
       </w:r>
       <w:r>
-        <w:t xml:space="preserve">(1), 83-95. https://doi.org/10.1016/j.intman.2010.12.004</w:t>
+        <w:t xml:space="preserve">(1), 83–95. https://doi.org/10.1016/j.intman.2010.12.004</w:t>
       </w:r>
     </w:p>
     <w:p>
@@ -9064,7 +9064,7 @@
         <w:t xml:space="preserve">Competitiveness Review: An International Business Journal, 31</w:t>
       </w:r>
       <w:r>
-        <w:t xml:space="preserve">(4), 642-662. https://doi.org/10.1108/cr-03-2019-0028</w:t>
+        <w:t xml:space="preserve">(4), 642–662. https://doi.org/10.1108/cr-03-2019-0028</w:t>
       </w:r>
     </w:p>
     <w:p>
@@ -9085,7 +9085,7 @@
         <w:t xml:space="preserve">European Journal of Marketing, 49</w:t>
       </w:r>
       <w:r>
-        <w:t xml:space="preserve">(3/4), 420-443. https://doi.org/10.1108/ejm-06-2012-0365</w:t>
+        <w:t xml:space="preserve">(3/4), 420–443. https://doi.org/10.1108/ejm-06-2012-0365</w:t>
       </w:r>
     </w:p>
     <w:p>
@@ -9106,7 +9106,7 @@
         <w:t xml:space="preserve">Decision Science Letters, 9</w:t>
       </w:r>
       <w:r>
-        <w:t xml:space="preserve">(4), 573-580. https://doi.org/10.5267/j.dsl.2020.7.001</w:t>
+        <w:t xml:space="preserve">(4), 573–580. https://doi.org/10.5267/j.dsl.2020.7.001</w:t>
       </w:r>
     </w:p>
     <w:p>
@@ -9190,7 +9190,7 @@
         <w:t xml:space="preserve">Journal of Business Economics and Management, 16</w:t>
       </w:r>
       <w:r>
-        <w:t xml:space="preserve">(1), 52-73. https://doi.org/10.3846/16111699.2012.745812</w:t>
+        <w:t xml:space="preserve">(1), 52–73. https://doi.org/10.3846/16111699.2012.745812</w:t>
       </w:r>
     </w:p>
     <w:p>
@@ -9211,7 +9211,7 @@
         <w:t xml:space="preserve">Management International Review, 62</w:t>
       </w:r>
       <w:r>
-        <w:t xml:space="preserve">(1), 3-26. https://doi.org/10.1007/s11575-022-00464-3</w:t>
+        <w:t xml:space="preserve">(1), 3–26. https://doi.org/10.1007/s11575-022-00464-3</w:t>
       </w:r>
     </w:p>
     <w:p>
@@ -9232,7 +9232,7 @@
         <w:t xml:space="preserve">Journal of Business Research, 66</w:t>
       </w:r>
       <w:r>
-        <w:t xml:space="preserve">(12), 2500-2506. https://doi.org/10.1016/j.jbusres.2013.05.041</w:t>
+        <w:t xml:space="preserve">(12), 2500–2506. https://doi.org/10.1016/j.jbusres.2013.05.041</w:t>
       </w:r>
     </w:p>
     <w:p>
@@ -9253,7 +9253,7 @@
         <w:t xml:space="preserve">Journal of Business Research, 95</w:t>
       </w:r>
       <w:r>
-        <w:t xml:space="preserve">, 326-337. https://doi.org/10.1016/j.jbusres.2018.08.014</w:t>
+        <w:t xml:space="preserve">, 326–337. https://doi.org/10.1016/j.jbusres.2018.08.014</w:t>
       </w:r>
     </w:p>
     <w:p>
@@ -9295,7 +9295,7 @@
         <w:t xml:space="preserve">British Journal of Management, 32</w:t>
       </w:r>
       <w:r>
-        <w:t xml:space="preserve">(4), 1032-1052. https://doi.org/10.1111/1467-8551.12560</w:t>
+        <w:t xml:space="preserve">(4), 1032–1052. https://doi.org/10.1111/1467-8551.12560</w:t>
       </w:r>
     </w:p>
     <w:p>
@@ -9316,7 +9316,7 @@
         <w:t xml:space="preserve">Journal of Multinational Financial Management, 34</w:t>
       </w:r>
       <w:r>
-        <w:t xml:space="preserve">, 28-45. https://doi.org/10.1016/j.mulfin.2015.12.001</w:t>
+        <w:t xml:space="preserve">, 28–45. https://doi.org/10.1016/j.mulfin.2015.12.001</w:t>
       </w:r>
     </w:p>
     <w:p>
@@ -9400,7 +9400,7 @@
         <w:t xml:space="preserve">Journal of International Marketing, 8</w:t>
       </w:r>
       <w:r>
-        <w:t xml:space="preserve">(3), 10-35. https://doi.org/10.1509/jimk.8.3.10.19635</w:t>
+        <w:t xml:space="preserve">(3), 10–35. https://doi.org/10.1509/jimk.8.3.10.19635</w:t>
       </w:r>
     </w:p>
     <w:p>
@@ -9421,7 +9421,7 @@
         <w:t xml:space="preserve">Management Decision, 47</w:t>
       </w:r>
       <w:r>
-        <w:t xml:space="preserve">(2), 308-329. https://doi.org/10.1108/00251740910938939</w:t>
+        <w:t xml:space="preserve">(2), 308–329. https://doi.org/10.1108/00251740910938939</w:t>
       </w:r>
     </w:p>
     <w:p>
@@ -9442,7 +9442,7 @@
         <w:t xml:space="preserve">Applied Economics, 50</w:t>
       </w:r>
       <w:r>
-        <w:t xml:space="preserve">(2), 135-148. https://doi.org/10.1080/00036846.2017.1321839</w:t>
+        <w:t xml:space="preserve">(2), 135–148. https://doi.org/10.1080/00036846.2017.1321839</w:t>
       </w:r>
     </w:p>
     <w:p>
@@ -9463,7 +9463,7 @@
         <w:t xml:space="preserve">Economia e Diritto del Terziario, 28</w:t>
       </w:r>
       <w:r>
-        <w:t xml:space="preserve">(1), 5-22.</w:t>
+        <w:t xml:space="preserve">(1), 5–22.</w:t>
       </w:r>
     </w:p>
     <w:p>
@@ -9484,7 +9484,7 @@
         <w:t xml:space="preserve">International Entrepreneurship and Management Journal, 10</w:t>
       </w:r>
       <w:r>
-        <w:t xml:space="preserve">(1), 1-15. https://doi.org/10.1007/s11365-011-0218-8</w:t>
+        <w:t xml:space="preserve">(1), 1–15. https://doi.org/10.1007/s11365-011-0218-8</w:t>
       </w:r>
     </w:p>
     <w:bookmarkEnd w:id="45"/>
@@ -9559,7 +9559,7 @@
         <w:t xml:space="preserve">Global Strategy Journal, 10</w:t>
       </w:r>
       <w:r>
-        <w:t xml:space="preserve">(2), 239-250. https://doi.org/10.1002/gsj.1383</w:t>
+        <w:t xml:space="preserve">(2), 239–250. https://doi.org/10.1002/gsj.1383</w:t>
       </w:r>
     </w:p>
     <w:p>
@@ -9580,7 +9580,7 @@
         <w:t xml:space="preserve">Journal of International Business Studies, 48</w:t>
       </w:r>
       <w:r>
-        <w:t xml:space="preserve">(9), 1087-1102. https://doi.org/10.1057/s41267-017-0107-7</w:t>
+        <w:t xml:space="preserve">(9), 1087–1102. https://doi.org/10.1057/s41267-017-0107-7</w:t>
       </w:r>
     </w:p>
     <w:bookmarkEnd w:id="46"/>
@@ -9619,7 +9619,7 @@
         <w:t xml:space="preserve">Journal of Management, 37</w:t>
       </w:r>
       <w:r>
-        <w:t xml:space="preserve">(1), 5-38. https://doi.org/10.1177/0149206310370708</w:t>
+        <w:t xml:space="preserve">(1), 5–38. https://doi.org/10.1177/0149206310370708</w:t>
       </w:r>
     </w:p>
     <w:p>
@@ -9643,7 +9643,7 @@
         <w:t xml:space="preserve"> </w:t>
       </w:r>
       <w:r>
-        <w:t xml:space="preserve">(pp. 49-62). Croom Helm.</w:t>
+        <w:t xml:space="preserve">(pp. 49–62). Croom Helm.</w:t>
       </w:r>
     </w:p>
     <w:p>
@@ -9688,7 +9688,7 @@
         <w:t xml:space="preserve">World Development, 23</w:t>
       </w:r>
       <w:r>
-        <w:t xml:space="preserve">(9), 1615-1632. https://doi.org/10.1016/0305-750X(95)00065-K</w:t>
+        <w:t xml:space="preserve">(9), 1615–1632. https://doi.org/10.1016/0305-750X(95)00065-K</w:t>
       </w:r>
     </w:p>
     <w:p>
@@ -9709,7 +9709,7 @@
         <w:t xml:space="preserve">Journal of Human Resources, 50</w:t>
       </w:r>
       <w:r>
-        <w:t xml:space="preserve">(2), 317-372. https://doi.org/10.3368/jhr.50.2.317</w:t>
+        <w:t xml:space="preserve">(2), 317–372. https://doi.org/10.3368/jhr.50.2.317</w:t>
       </w:r>
     </w:p>
     <w:p>
@@ -9754,7 +9754,7 @@
         <w:t xml:space="preserve">Global Strategy Journal, 2</w:t>
       </w:r>
       <w:r>
-        <w:t xml:space="preserve">(4), 318-331. https://doi.org/10.1111/j.2042-5805.2012.01043.x</w:t>
+        <w:t xml:space="preserve">(4), 318–331. https://doi.org/10.1111/j.2042-5805.2012.01043.x</w:t>
       </w:r>
     </w:p>
     <w:p>
@@ -9823,7 +9823,7 @@
         <w:t xml:space="preserve">Academy of Management Review, 32</w:t>
       </w:r>
       <w:r>
-        <w:t xml:space="preserve">(2), 334-343. https://doi.org/10.5465/amr.2007.24345254</w:t>
+        <w:t xml:space="preserve">(2), 334–343. https://doi.org/10.5465/amr.2007.24345254</w:t>
       </w:r>
     </w:p>
     <w:p>
@@ -9844,7 +9844,7 @@
         <w:t xml:space="preserve">Academy of Management Review, 9</w:t>
       </w:r>
       <w:r>
-        <w:t xml:space="preserve">(2), 193-206. https://doi.org/10.5465/amr.1984.4277628</w:t>
+        <w:t xml:space="preserve">(2), 193–206. https://doi.org/10.5465/amr.1984.4277628</w:t>
       </w:r>
     </w:p>
     <w:p>
@@ -9886,7 +9886,7 @@
         <w:t xml:space="preserve">American Economic Review, 94</w:t>
       </w:r>
       <w:r>
-        <w:t xml:space="preserve">(1), 300-316. https://doi.org/10.1257/000282804322970814</w:t>
+        <w:t xml:space="preserve">(1), 300–316. https://doi.org/10.1257/000282804322970814</w:t>
       </w:r>
     </w:p>
     <w:p>
@@ -9907,7 +9907,7 @@
         <w:t xml:space="preserve">Journal of Industrial Economics, 27</w:t>
       </w:r>
       <w:r>
-        <w:t xml:space="preserve">(4), 359-369. https://doi.org/10.2307/2097958</w:t>
+        <w:t xml:space="preserve">(4), 359–369. https://doi.org/10.2307/2097958</w:t>
       </w:r>
     </w:p>
     <w:p>
@@ -9949,7 +9949,7 @@
         <w:t xml:space="preserve">Review of Managerial Science, 16</w:t>
       </w:r>
       <w:r>
-        <w:t xml:space="preserve">(8), 2577-2595. https://doi.org/10.1007/s11846-022-00588-8</w:t>
+        <w:t xml:space="preserve">(8), 2577–2595. https://doi.org/10.1007/s11846-022-00588-8</w:t>
       </w:r>
     </w:p>
     <w:p>
@@ -9970,7 +9970,7 @@
         <w:t xml:space="preserve">Biometrics, 33</w:t>
       </w:r>
       <w:r>
-        <w:t xml:space="preserve">(1), 159-174. https://doi.org/10.2307/2529310</w:t>
+        <w:t xml:space="preserve">(1), 159–174. https://doi.org/10.2307/2529310</w:t>
       </w:r>
     </w:p>
     <w:p>
@@ -9991,7 +9991,7 @@
         <w:t xml:space="preserve">Journal of International Business Studies, 39</w:t>
       </w:r>
       <w:r>
-        <w:t xml:space="preserve">(5), 920-936. https://doi.org/10.1057/palgrave.jibs.8400377</w:t>
+        <w:t xml:space="preserve">(5), 920–936. https://doi.org/10.1057/palgrave.jibs.8400377</w:t>
       </w:r>
     </w:p>
     <w:p>
@@ -10012,7 +10012,7 @@
         <w:t xml:space="preserve">Journal of Applied Psychology, 90</w:t>
       </w:r>
       <w:r>
-        <w:t xml:space="preserve">(1), 175-181. https://doi.org/10.1037/0021-9010.90.1.175</w:t>
+        <w:t xml:space="preserve">(1), 175–181. https://doi.org/10.1037/0021-9010.90.1.175</w:t>
       </w:r>
     </w:p>
     <w:p>
@@ -10084,7 +10084,7 @@
         <w:t xml:space="preserve"> </w:t>
       </w:r>
       <w:r>
-        <w:t xml:space="preserve">(pp. 231-244). Sage.</w:t>
+        <w:t xml:space="preserve">(pp. 231–244). Sage.</w:t>
       </w:r>
     </w:p>
     <w:p>
@@ -10105,7 +10105,7 @@
         <w:t xml:space="preserve">European Economic Review, 45</w:t>
       </w:r>
       <w:r>
-        <w:t xml:space="preserve">(4-6), 827-838. https://doi.org/10.1016/S0014-2921(01)00125-8</w:t>
+        <w:t xml:space="preserve">(4-6), 827–838. https://doi.org/10.1016/S0014-2921(01)00125-8</w:t>
       </w:r>
     </w:p>
     <w:p>
@@ -10150,7 +10150,7 @@
         <w:t xml:space="preserve">Journal of Human Resources, 50</w:t>
       </w:r>
       <w:r>
-        <w:t xml:space="preserve">(2), 301-316. https://doi.org/10.3368/jhr.50.2.301</w:t>
+        <w:t xml:space="preserve">(2), 301–316. https://doi.org/10.3368/jhr.50.2.301</w:t>
       </w:r>
     </w:p>
     <w:p>
@@ -10171,7 +10171,7 @@
         <w:t xml:space="preserve">Research Synthesis Methods, 5</w:t>
       </w:r>
       <w:r>
-        <w:t xml:space="preserve">(1), 60-78. https://doi.org/10.1002/jrsm.1095</w:t>
+        <w:t xml:space="preserve">(1), 60–78. https://doi.org/10.1002/jrsm.1095</w:t>
       </w:r>
     </w:p>
     <w:p>
@@ -10192,7 +10192,7 @@
         <w:t xml:space="preserve">Statistics in Medicine, 27</w:t>
       </w:r>
       <w:r>
-        <w:t xml:space="preserve">(5), 625-650. https://doi.org/10.1002/sim.2982</w:t>
+        <w:t xml:space="preserve">(5), 625–650. https://doi.org/10.1002/sim.2982</w:t>
       </w:r>
     </w:p>
     <w:p>
@@ -10213,7 +10213,7 @@
         <w:t xml:space="preserve">Journal of Statistical Software, 36</w:t>
       </w:r>
       <w:r>
-        <w:t xml:space="preserve">(3), 1-48. https://doi.org/10.18637/jss.v036.i03</w:t>
+        <w:t xml:space="preserve">(3), 1–48. https://doi.org/10.18637/jss.v036.i03</w:t>
       </w:r>
     </w:p>
     <w:p>
@@ -10344,7 +10344,7 @@
         <w:t xml:space="preserve">2</w:t>
       </w:r>
       <w:r>
-        <w:t xml:space="preserve">(1), 111-115.</w:t>
+        <w:t xml:space="preserve">(1), 111–115.</w:t>
       </w:r>
     </w:p>
     <w:p>
@@ -10378,7 +10378,7 @@
         <w:t xml:space="preserve">39</w:t>
       </w:r>
       <w:r>
-        <w:t xml:space="preserve">(2), 287-291.</w:t>
+        <w:t xml:space="preserve">(2), 287–291.</w:t>
       </w:r>
     </w:p>
     <w:bookmarkEnd w:id="48"/>
@@ -10409,7 +10409,7 @@
         <w:t xml:space="preserve">Journal of Business Research, 139</w:t>
       </w:r>
       <w:r>
-        <w:t xml:space="preserve">, 230-245. https://doi.org/10.1016/j.jbusres.2021.09.060</w:t>
+        <w:t xml:space="preserve">, 230–245. https://doi.org/10.1016/j.jbusres.2021.09.060</w:t>
       </w:r>
     </w:p>
     <w:p>
@@ -10430,7 +10430,7 @@
         <w:t xml:space="preserve">Economic Development and Cultural Change, 59</w:t>
       </w:r>
       <w:r>
-        <w:t xml:space="preserve">(3), 609-647. https://doi.org/10.1086/658349</w:t>
+        <w:t xml:space="preserve">(3), 609–647. https://doi.org/10.1086/658349</w:t>
       </w:r>
     </w:p>
     <w:p>
@@ -10482,7 +10482,7 @@
         <w:t xml:space="preserve">Econometrica, 47</w:t>
       </w:r>
       <w:r>
-        <w:t xml:space="preserve">(5), 1287-1294. https://doi.org/10.2307/1911963</w:t>
+        <w:t xml:space="preserve">(5), 1287–1294. https://doi.org/10.2307/1911963</w:t>
       </w:r>
     </w:p>
     <w:p>
@@ -10527,7 +10527,7 @@
         <w:t xml:space="preserve">BMJ, 327</w:t>
       </w:r>
       <w:r>
-        <w:t xml:space="preserve">(7414), 557-560. https://doi.org/10.1136/bmj.327.7414.557</w:t>
+        <w:t xml:space="preserve">(7414), 557–560. https://doi.org/10.1136/bmj.327.7414.557</w:t>
       </w:r>
     </w:p>
     <w:p>
@@ -10548,7 +10548,7 @@
         <w:t xml:space="preserve">Hague Journal on the Rule of Law, 3</w:t>
       </w:r>
       <w:r>
-        <w:t xml:space="preserve">(2), 220-246. https://doi.org/10.1017/S1876404511200046</w:t>
+        <w:t xml:space="preserve">(2), 220–246. https://doi.org/10.1017/S1876404511200046</w:t>
       </w:r>
     </w:p>
     <w:bookmarkEnd w:id="49"/>
@@ -10579,7 +10579,7 @@
         <w:t xml:space="preserve">Academy of Management Review, 28</w:t>
       </w:r>
       <w:r>
-        <w:t xml:space="preserve">(2), 275-296. https://doi.org/10.5465/amr.2003.9416341</w:t>
+        <w:t xml:space="preserve">(2), 275–296. https://doi.org/10.5465/amr.2003.9416341</w:t>
       </w:r>
     </w:p>
     <w:p>
@@ -10600,7 +10600,7 @@
         <w:t xml:space="preserve">Research Policy, 15</w:t>
       </w:r>
       <w:r>
-        <w:t xml:space="preserve">(6), 285-305. https://doi.org/10.1016/0048-7333(86)90027-2</w:t>
+        <w:t xml:space="preserve">(6), 285–305. https://doi.org/10.1016/0048-7333(86)90027-2</w:t>
       </w:r>
     </w:p>
     <w:bookmarkEnd w:id="50"/>

</xml_diff>